<commit_message>
mod/hash field added to word template
</commit_message>
<xml_diff>
--- a/public/plantilla_certificado.docx
+++ b/public/plantilla_certificado.docx
@@ -16,7 +16,7 @@
           <w:lang w:eastAsia="es-MX"/>
         </w:rPr>
         <w:drawing>
-          <wp:anchor distT="0" distB="0" distL="114300" distR="114300" simplePos="0" relativeHeight="251661312" behindDoc="1" locked="0" layoutInCell="1" allowOverlap="1" wp14:anchorId="7CEB3E35" wp14:editId="391864AE">
+          <wp:anchor distT="0" distB="0" distL="114300" distR="114300" simplePos="0" relativeHeight="251661312" behindDoc="1" locked="0" layoutInCell="1" allowOverlap="1" wp14:anchorId="7CEB3E35" wp14:editId="0BA50C61">
             <wp:simplePos x="0" y="0"/>
             <wp:positionH relativeFrom="margin">
               <wp:posOffset>-3011</wp:posOffset>
@@ -608,6 +608,122 @@
       <w:r>
         <w:rPr>
           <w:rFonts w:ascii="Segoe UI" w:hAnsi="Segoe UI" w:cs="Segoe UI"/>
+          <w:noProof/>
+        </w:rPr>
+        <mc:AlternateContent>
+          <mc:Choice Requires="wps">
+            <w:drawing>
+              <wp:anchor distT="45720" distB="45720" distL="114300" distR="114300" simplePos="0" relativeHeight="251663360" behindDoc="0" locked="0" layoutInCell="1" allowOverlap="1" wp14:anchorId="279BB56B" wp14:editId="11A0270F">
+                <wp:simplePos x="0" y="0"/>
+                <wp:positionH relativeFrom="column">
+                  <wp:posOffset>2802890</wp:posOffset>
+                </wp:positionH>
+                <wp:positionV relativeFrom="paragraph">
+                  <wp:posOffset>4174490</wp:posOffset>
+                </wp:positionV>
+                <wp:extent cx="2892425" cy="1404620"/>
+                <wp:effectExtent l="0" t="0" r="0" b="0"/>
+                <wp:wrapNone/>
+                <wp:docPr id="2" name="Cuadro de texto 2"/>
+                <wp:cNvGraphicFramePr>
+                  <a:graphicFrameLocks xmlns:a="http://schemas.openxmlformats.org/drawingml/2006/main"/>
+                </wp:cNvGraphicFramePr>
+                <a:graphic xmlns:a="http://schemas.openxmlformats.org/drawingml/2006/main">
+                  <a:graphicData uri="http://schemas.microsoft.com/office/word/2010/wordprocessingShape">
+                    <wps:wsp>
+                      <wps:cNvSpPr txBox="1">
+                        <a:spLocks noChangeArrowheads="1"/>
+                      </wps:cNvSpPr>
+                      <wps:spPr bwMode="auto">
+                        <a:xfrm>
+                          <a:off x="0" y="0"/>
+                          <a:ext cx="2892425" cy="1404620"/>
+                        </a:xfrm>
+                        <a:prstGeom prst="rect">
+                          <a:avLst/>
+                        </a:prstGeom>
+                        <a:noFill/>
+                        <a:ln w="9525">
+                          <a:noFill/>
+                          <a:miter lim="800000"/>
+                          <a:headEnd/>
+                          <a:tailEnd/>
+                        </a:ln>
+                      </wps:spPr>
+                      <wps:txbx>
+                        <w:txbxContent>
+                          <w:p>
+                            <w:pPr>
+                              <w:jc w:val="right"/>
+                              <w:rPr>
+                                <w:rFonts w:ascii="Courier New" w:hAnsi="Courier New" w:cs="Courier New"/>
+                                <w:color w:val="595959" w:themeColor="text1" w:themeTint="A6"/>
+                                <w:sz w:val="18"/>
+                                <w:szCs w:val="18"/>
+                              </w:rPr>
+                            </w:pPr>
+                            <w:r>
+                              <w:rPr>
+                                <w:rFonts w:ascii="Courier New" w:hAnsi="Courier New" w:cs="Courier New"/>
+                                <w:color w:val="595959" w:themeColor="text1" w:themeTint="A6"/>
+                                <w:sz w:val="18"/>
+                                <w:szCs w:val="18"/>
+                              </w:rPr>
+                              <w:t>hash: +++hash+++</w:t>
+                            </w:r>
+                          </w:p>
+                        </w:txbxContent>
+                      </wps:txbx>
+                      <wps:bodyPr rot="0" vert="horz" wrap="square" lIns="91440" tIns="45720" rIns="91440" bIns="45720" anchor="t" anchorCtr="0">
+                        <a:spAutoFit/>
+                      </wps:bodyPr>
+                    </wps:wsp>
+                  </a:graphicData>
+                </a:graphic>
+                <wp14:sizeRelH relativeFrom="margin">
+                  <wp14:pctWidth>0</wp14:pctWidth>
+                </wp14:sizeRelH>
+                <wp14:sizeRelV relativeFrom="margin">
+                  <wp14:pctHeight>20000</wp14:pctHeight>
+                </wp14:sizeRelV>
+              </wp:anchor>
+            </w:drawing>
+          </mc:Choice>
+          <mc:Fallback>
+            <w:pict>
+              <v:shape w14:anchorId="279BB56B" id="Cuadro de texto 2" o:spid="_x0000_s1027" type="#_x0000_t202" style="position:absolute;left:0;text-align:left;margin-left:220.7pt;margin-top:328.7pt;width:227.75pt;height:110.6pt;z-index:251663360;visibility:visible;mso-wrap-style:square;mso-width-percent:0;mso-height-percent:200;mso-wrap-distance-left:9pt;mso-wrap-distance-top:3.6pt;mso-wrap-distance-right:9pt;mso-wrap-distance-bottom:3.6pt;mso-position-horizontal:absolute;mso-position-horizontal-relative:text;mso-position-vertical:absolute;mso-position-vertical-relative:text;mso-width-percent:0;mso-height-percent:200;mso-width-relative:margin;mso-height-relative:margin;v-text-anchor:top" o:gfxdata="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" filled="f" stroked="f">
+                <v:textbox style="mso-fit-shape-to-text:t">
+                  <w:txbxContent>
+                    <w:p>
+                      <w:pPr>
+                        <w:jc w:val="right"/>
+                        <w:rPr>
+                          <w:rFonts w:ascii="Courier New" w:hAnsi="Courier New" w:cs="Courier New"/>
+                          <w:color w:val="595959" w:themeColor="text1" w:themeTint="A6"/>
+                          <w:sz w:val="18"/>
+                          <w:szCs w:val="18"/>
+                        </w:rPr>
+                      </w:pPr>
+                      <w:r>
+                        <w:rPr>
+                          <w:rFonts w:ascii="Courier New" w:hAnsi="Courier New" w:cs="Courier New"/>
+                          <w:color w:val="595959" w:themeColor="text1" w:themeTint="A6"/>
+                          <w:sz w:val="18"/>
+                          <w:szCs w:val="18"/>
+                        </w:rPr>
+                        <w:t>hash: +++hash+++</w:t>
+                      </w:r>
+                    </w:p>
+                  </w:txbxContent>
+                </v:textbox>
+              </v:shape>
+            </w:pict>
+          </mc:Fallback>
+        </mc:AlternateContent>
+      </w:r>
+      <w:r>
+        <w:rPr>
+          <w:rFonts w:ascii="Segoe UI" w:hAnsi="Segoe UI" w:cs="Segoe UI"/>
           <w:b/>
           <w:noProof/>
           <w:sz w:val="26"/>
@@ -670,11 +786,19 @@
                             </w:r>
                             <w:proofErr w:type="spellStart"/>
                             <w:r>
-                              <w:t>short_url</w:t>
+                              <w:t>short_</w:t>
+                            </w:r>
+                            <w:proofErr w:type="gramStart"/>
+                            <w:r>
+                              <w:t>url</w:t>
                             </w:r>
                             <w:proofErr w:type="spellEnd"/>
                             <w:r>
-                              <w:t>)+++</w:t>
+                              <w:t>)+</w:t>
+                            </w:r>
+                            <w:proofErr w:type="gramEnd"/>
+                            <w:r>
+                              <w:t>++</w:t>
                             </w:r>
                           </w:p>
                         </w:txbxContent>
@@ -696,7 +820,7 @@
           </mc:Choice>
           <mc:Fallback>
             <w:pict>
-              <v:shape w14:anchorId="2ED3699C" id="Cuadro de texto 2" o:spid="_x0000_s1027" type="#_x0000_t202" style="position:absolute;left:0;text-align:left;margin-left:346.9pt;margin-top:554.8pt;width:103.2pt;height:94.7pt;z-index:251660288;visibility:visible;mso-wrap-style:square;mso-width-percent:0;mso-height-percent:0;mso-wrap-distance-left:9pt;mso-wrap-distance-top:3.6pt;mso-wrap-distance-right:9pt;mso-wrap-distance-bottom:3.6pt;mso-position-horizontal:absolute;mso-position-horizontal-relative:margin;mso-position-vertical:absolute;mso-position-vertical-relative:page;mso-width-percent:0;mso-height-percent:0;mso-width-relative:margin;mso-height-relative:margin;v-text-anchor:top" o:gfxdata="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" filled="f" stroked="f">
+              <v:shape w14:anchorId="2ED3699C" id="_x0000_s1028" type="#_x0000_t202" style="position:absolute;left:0;text-align:left;margin-left:346.9pt;margin-top:554.8pt;width:103.2pt;height:94.7pt;z-index:251660288;visibility:visible;mso-wrap-style:square;mso-width-percent:0;mso-height-percent:0;mso-wrap-distance-left:9pt;mso-wrap-distance-top:3.6pt;mso-wrap-distance-right:9pt;mso-wrap-distance-bottom:3.6pt;mso-position-horizontal:absolute;mso-position-horizontal-relative:margin;mso-position-vertical:absolute;mso-position-vertical-relative:page;mso-width-percent:0;mso-height-percent:0;mso-width-relative:margin;mso-height-relative:margin;v-text-anchor:top" o:gfxdata="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" filled="f" stroked="f">
                 <v:textbox>
                   <w:txbxContent>
                     <w:p>
@@ -713,11 +837,19 @@
                       </w:r>
                       <w:proofErr w:type="spellStart"/>
                       <w:r>
-                        <w:t>short_url</w:t>
+                        <w:t>short_</w:t>
+                      </w:r>
+                      <w:proofErr w:type="gramStart"/>
+                      <w:r>
+                        <w:t>url</w:t>
                       </w:r>
                       <w:proofErr w:type="spellEnd"/>
                       <w:r>
-                        <w:t>)+++</w:t>
+                        <w:t>)+</w:t>
+                      </w:r>
+                      <w:proofErr w:type="gramEnd"/>
+                      <w:r>
+                        <w:t>++</w:t>
                       </w:r>
                     </w:p>
                   </w:txbxContent>
@@ -891,6 +1023,7 @@
                               <w:rFonts w:ascii="Consolas" w:hAnsi="Consolas"/>
                               <w:sz w:val="22"/>
                               <w:szCs w:val="22"/>
+                              <w:lang w:val="en-US"/>
                             </w:rPr>
                           </w:pPr>
                           <w:r>
@@ -899,6 +1032,7 @@
                               <w:b/>
                               <w:sz w:val="22"/>
                               <w:szCs w:val="22"/>
+                              <w:lang w:val="en-US"/>
                             </w:rPr>
                             <w:t>RFC</w:t>
                           </w:r>
@@ -907,6 +1041,7 @@
                               <w:rFonts w:ascii="Consolas" w:hAnsi="Consolas"/>
                               <w:sz w:val="22"/>
                               <w:szCs w:val="22"/>
+                              <w:lang w:val="en-US"/>
                             </w:rPr>
                             <w:t>: LOCX570224381</w:t>
                           </w:r>
@@ -917,7 +1052,7 @@
                               <w:rFonts w:ascii="Consolas" w:hAnsi="Consolas" w:cs="Arial"/>
                               <w:sz w:val="22"/>
                               <w:szCs w:val="22"/>
-                              <w:lang w:val="es-ES"/>
+                              <w:lang w:val="en-US"/>
                             </w:rPr>
                           </w:pPr>
                           <w:r>
@@ -926,36 +1061,36 @@
                               <w:b/>
                               <w:sz w:val="22"/>
                               <w:szCs w:val="22"/>
-                              <w:lang w:val="es-ES"/>
+                              <w:lang w:val="en-US"/>
                             </w:rPr>
-                            <w:t>TELS</w:t>
+                            <w:t>TEL</w:t>
                           </w:r>
                           <w:r>
                             <w:rPr>
                               <w:rFonts w:ascii="Consolas" w:hAnsi="Consolas" w:cs="Arial"/>
                               <w:sz w:val="22"/>
                               <w:szCs w:val="22"/>
-                              <w:lang w:val="es-ES"/>
+                              <w:lang w:val="en-US"/>
                             </w:rPr>
-                            <w:t>: 273</w:t>
+                            <w:t>:</w:t>
                           </w:r>
                           <w:r>
                             <w:rPr>
                               <w:rFonts w:ascii="Consolas" w:hAnsi="Consolas" w:cs="Arial"/>
                               <w:sz w:val="22"/>
                               <w:szCs w:val="22"/>
-                              <w:lang w:val="es-ES"/>
+                              <w:lang w:val="en-US"/>
                             </w:rPr>
-                            <w:t>73</w:t>
+                            <w:t xml:space="preserve"> </w:t>
                           </w:r>
                           <w:r>
                             <w:rPr>
                               <w:rFonts w:ascii="Consolas" w:hAnsi="Consolas" w:cs="Arial"/>
                               <w:sz w:val="22"/>
                               <w:szCs w:val="22"/>
-                              <w:lang w:val="es-ES"/>
+                              <w:lang w:val="en-US"/>
                             </w:rPr>
-                            <w:t xml:space="preserve">42913 y 2731054784   </w:t>
+                            <w:t xml:space="preserve">2731054784   </w:t>
                           </w:r>
                         </w:p>
                         <w:p>
@@ -964,6 +1099,7 @@
                               <w:rFonts w:ascii="Consolas" w:hAnsi="Consolas"/>
                               <w:sz w:val="22"/>
                               <w:szCs w:val="22"/>
+                              <w:lang w:val="en-US"/>
                             </w:rPr>
                           </w:pPr>
                           <w:r>
@@ -972,7 +1108,7 @@
                               <w:b/>
                               <w:sz w:val="22"/>
                               <w:szCs w:val="22"/>
-                              <w:lang w:val="es-ES"/>
+                              <w:lang w:val="en-US"/>
                             </w:rPr>
                             <w:t>E–mail</w:t>
                           </w:r>
@@ -981,7 +1117,7 @@
                               <w:rFonts w:ascii="Consolas" w:hAnsi="Consolas" w:cs="Arial"/>
                               <w:sz w:val="22"/>
                               <w:szCs w:val="22"/>
-                              <w:lang w:val="es-ES"/>
+                              <w:lang w:val="en-US"/>
                             </w:rPr>
                             <w:t xml:space="preserve">: </w:t>
                           </w:r>
@@ -990,7 +1126,7 @@
                               <w:rFonts w:ascii="Consolas" w:hAnsi="Consolas"/>
                               <w:sz w:val="22"/>
                               <w:szCs w:val="22"/>
-                              <w:lang w:val="es-ES"/>
+                              <w:lang w:val="en-US"/>
                             </w:rPr>
                             <w:t>exter_ver@yahoo.com.mx</w:t>
                           </w:r>
@@ -1014,7 +1150,7 @@
         </mc:Choice>
         <mc:Fallback>
           <w:pict>
-            <v:rect w14:anchorId="28AC39CD" id="Rectangle 10" o:spid="_x0000_s1028" style="position:absolute;left:0;text-align:left;margin-left:0;margin-top:0;width:440.55pt;height:88.5pt;z-index:251663360;visibility:visible;mso-wrap-style:square;mso-width-percent:0;mso-height-percent:0;mso-wrap-distance-left:9pt;mso-wrap-distance-top:0;mso-wrap-distance-right:9pt;mso-wrap-distance-bottom:0;mso-position-horizontal:absolute;mso-position-horizontal-relative:margin;mso-position-vertical:absolute;mso-position-vertical-relative:text;mso-width-percent:0;mso-height-percent:0;mso-width-relative:page;mso-height-relative:page;v-text-anchor:top" o:gfxdata="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" filled="f" strokecolor="black [3213]" strokeweight="1.5pt">
+            <v:rect w14:anchorId="28AC39CD" id="Rectangle 10" o:spid="_x0000_s1029" style="position:absolute;left:0;text-align:left;margin-left:0;margin-top:0;width:440.55pt;height:88.5pt;z-index:251663360;visibility:visible;mso-wrap-style:square;mso-width-percent:0;mso-height-percent:0;mso-wrap-distance-left:9pt;mso-wrap-distance-top:0;mso-wrap-distance-right:9pt;mso-wrap-distance-bottom:0;mso-position-horizontal:absolute;mso-position-horizontal-relative:margin;mso-position-vertical:absolute;mso-position-vertical-relative:text;mso-width-percent:0;mso-height-percent:0;mso-width-relative:page;mso-height-relative:page;v-text-anchor:top" o:gfxdata="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" filled="f" strokecolor="black [3213]" strokeweight="1.5pt">
               <v:textbox inset="2mm,4mm,.5mm,.5mm">
                 <w:txbxContent>
                   <w:p>
@@ -1068,6 +1204,7 @@
                         <w:rFonts w:ascii="Consolas" w:hAnsi="Consolas"/>
                         <w:sz w:val="22"/>
                         <w:szCs w:val="22"/>
+                        <w:lang w:val="en-US"/>
                       </w:rPr>
                     </w:pPr>
                     <w:r>
@@ -1076,6 +1213,7 @@
                         <w:b/>
                         <w:sz w:val="22"/>
                         <w:szCs w:val="22"/>
+                        <w:lang w:val="en-US"/>
                       </w:rPr>
                       <w:t>RFC</w:t>
                     </w:r>
@@ -1084,6 +1222,7 @@
                         <w:rFonts w:ascii="Consolas" w:hAnsi="Consolas"/>
                         <w:sz w:val="22"/>
                         <w:szCs w:val="22"/>
+                        <w:lang w:val="en-US"/>
                       </w:rPr>
                       <w:t>: LOCX570224381</w:t>
                     </w:r>
@@ -1094,7 +1233,7 @@
                         <w:rFonts w:ascii="Consolas" w:hAnsi="Consolas" w:cs="Arial"/>
                         <w:sz w:val="22"/>
                         <w:szCs w:val="22"/>
-                        <w:lang w:val="es-ES"/>
+                        <w:lang w:val="en-US"/>
                       </w:rPr>
                     </w:pPr>
                     <w:r>
@@ -1103,36 +1242,36 @@
                         <w:b/>
                         <w:sz w:val="22"/>
                         <w:szCs w:val="22"/>
-                        <w:lang w:val="es-ES"/>
+                        <w:lang w:val="en-US"/>
                       </w:rPr>
-                      <w:t>TELS</w:t>
+                      <w:t>TEL</w:t>
                     </w:r>
                     <w:r>
                       <w:rPr>
                         <w:rFonts w:ascii="Consolas" w:hAnsi="Consolas" w:cs="Arial"/>
                         <w:sz w:val="22"/>
                         <w:szCs w:val="22"/>
-                        <w:lang w:val="es-ES"/>
+                        <w:lang w:val="en-US"/>
                       </w:rPr>
-                      <w:t>: 273</w:t>
+                      <w:t>:</w:t>
                     </w:r>
                     <w:r>
                       <w:rPr>
                         <w:rFonts w:ascii="Consolas" w:hAnsi="Consolas" w:cs="Arial"/>
                         <w:sz w:val="22"/>
                         <w:szCs w:val="22"/>
-                        <w:lang w:val="es-ES"/>
+                        <w:lang w:val="en-US"/>
                       </w:rPr>
-                      <w:t>73</w:t>
+                      <w:t xml:space="preserve"> </w:t>
                     </w:r>
                     <w:r>
                       <w:rPr>
                         <w:rFonts w:ascii="Consolas" w:hAnsi="Consolas" w:cs="Arial"/>
                         <w:sz w:val="22"/>
                         <w:szCs w:val="22"/>
-                        <w:lang w:val="es-ES"/>
+                        <w:lang w:val="en-US"/>
                       </w:rPr>
-                      <w:t xml:space="preserve">42913 y 2731054784   </w:t>
+                      <w:t xml:space="preserve">2731054784   </w:t>
                     </w:r>
                   </w:p>
                   <w:p>
@@ -1141,6 +1280,7 @@
                         <w:rFonts w:ascii="Consolas" w:hAnsi="Consolas"/>
                         <w:sz w:val="22"/>
                         <w:szCs w:val="22"/>
+                        <w:lang w:val="en-US"/>
                       </w:rPr>
                     </w:pPr>
                     <w:r>
@@ -1149,7 +1289,7 @@
                         <w:b/>
                         <w:sz w:val="22"/>
                         <w:szCs w:val="22"/>
-                        <w:lang w:val="es-ES"/>
+                        <w:lang w:val="en-US"/>
                       </w:rPr>
                       <w:t>E–mail</w:t>
                     </w:r>
@@ -1158,7 +1298,7 @@
                         <w:rFonts w:ascii="Consolas" w:hAnsi="Consolas" w:cs="Arial"/>
                         <w:sz w:val="22"/>
                         <w:szCs w:val="22"/>
-                        <w:lang w:val="es-ES"/>
+                        <w:lang w:val="en-US"/>
                       </w:rPr>
                       <w:t xml:space="preserve">: </w:t>
                     </w:r>
@@ -1167,7 +1307,7 @@
                         <w:rFonts w:ascii="Consolas" w:hAnsi="Consolas"/>
                         <w:sz w:val="22"/>
                         <w:szCs w:val="22"/>
-                        <w:lang w:val="es-ES"/>
+                        <w:lang w:val="en-US"/>
                       </w:rPr>
                       <w:t>exter_ver@yahoo.com.mx</w:t>
                     </w:r>
@@ -1735,6 +1875,7 @@
     <w:lsdException w:name="HTML Sample" w:semiHidden="1" w:unhideWhenUsed="1"/>
     <w:lsdException w:name="HTML Typewriter" w:semiHidden="1" w:unhideWhenUsed="1"/>
     <w:lsdException w:name="HTML Variable" w:semiHidden="1" w:unhideWhenUsed="1"/>
+    <w:lsdException w:name="Normal Table" w:semiHidden="1" w:unhideWhenUsed="1"/>
     <w:lsdException w:name="annotation subject" w:semiHidden="1" w:unhideWhenUsed="1"/>
     <w:lsdException w:name="No List" w:semiHidden="1" w:unhideWhenUsed="1"/>
     <w:lsdException w:name="Outline List 1" w:semiHidden="1" w:unhideWhenUsed="1"/>
@@ -1777,8 +1918,11 @@
     <w:lsdException w:name="Table Contemporary" w:semiHidden="1" w:unhideWhenUsed="1"/>
     <w:lsdException w:name="Table Elegant" w:semiHidden="1" w:unhideWhenUsed="1"/>
     <w:lsdException w:name="Table Professional" w:semiHidden="1" w:unhideWhenUsed="1"/>
+    <w:lsdException w:name="Table Subtle 1" w:semiHidden="1" w:unhideWhenUsed="1"/>
     <w:lsdException w:name="Table Subtle 2" w:semiHidden="1" w:unhideWhenUsed="1"/>
     <w:lsdException w:name="Table Web 1" w:semiHidden="1" w:unhideWhenUsed="1"/>
+    <w:lsdException w:name="Table Web 2" w:semiHidden="1" w:unhideWhenUsed="1"/>
+    <w:lsdException w:name="Table Web 3" w:semiHidden="1" w:unhideWhenUsed="1"/>
     <w:lsdException w:name="Balloon Text" w:semiHidden="1" w:unhideWhenUsed="1"/>
     <w:lsdException w:name="Table Grid" w:uiPriority="59"/>
     <w:lsdException w:name="Table Theme" w:semiHidden="1" w:unhideWhenUsed="1"/>

</xml_diff>

<commit_message>
fix/hash not showed in word template
</commit_message>
<xml_diff>
--- a/public/plantilla_certificado.docx
+++ b/public/plantilla_certificado.docx
@@ -569,7 +569,6 @@
         </w:rPr>
         <w:t>+++</w:t>
       </w:r>
-      <w:proofErr w:type="spellStart"/>
       <w:r>
         <w:rPr>
           <w:rFonts w:ascii="Segoe UI" w:hAnsi="Segoe UI" w:cs="Segoe UI"/>
@@ -578,7 +577,6 @@
         </w:rPr>
         <w:t>areas</w:t>
       </w:r>
-      <w:proofErr w:type="spellEnd"/>
       <w:r>
         <w:rPr>
           <w:rFonts w:ascii="Segoe UI" w:hAnsi="Segoe UI" w:cs="Segoe UI"/>
@@ -603,6 +601,7 @@
           <w:rFonts w:ascii="Segoe UI" w:hAnsi="Segoe UI" w:cs="Segoe UI"/>
           <w:bCs/>
           <w:sz w:val="28"/>
+          <w:u w:val="single"/>
         </w:rPr>
       </w:pPr>
       <w:r>
@@ -613,18 +612,18 @@
         <mc:AlternateContent>
           <mc:Choice Requires="wps">
             <w:drawing>
-              <wp:anchor distT="45720" distB="45720" distL="114300" distR="114300" simplePos="0" relativeHeight="251663360" behindDoc="0" locked="0" layoutInCell="1" allowOverlap="1" wp14:anchorId="279BB56B" wp14:editId="11A0270F">
+              <wp:anchor distT="0" distB="0" distL="114300" distR="114300" simplePos="0" relativeHeight="251676672" behindDoc="1" locked="0" layoutInCell="1" allowOverlap="1" wp14:anchorId="1DC6D429" wp14:editId="768C6E6F">
                 <wp:simplePos x="0" y="0"/>
-                <wp:positionH relativeFrom="column">
-                  <wp:posOffset>2802890</wp:posOffset>
+                <wp:positionH relativeFrom="margin">
+                  <wp:posOffset>2793365</wp:posOffset>
                 </wp:positionH>
                 <wp:positionV relativeFrom="paragraph">
-                  <wp:posOffset>4174490</wp:posOffset>
+                  <wp:posOffset>3314644</wp:posOffset>
                 </wp:positionV>
                 <wp:extent cx="2892425" cy="1404620"/>
                 <wp:effectExtent l="0" t="0" r="0" b="0"/>
                 <wp:wrapNone/>
-                <wp:docPr id="2" name="Cuadro de texto 2"/>
+                <wp:docPr id="14" name="Cuadro de texto 14"/>
                 <wp:cNvGraphicFramePr>
                   <a:graphicFrameLocks xmlns:a="http://schemas.openxmlformats.org/drawingml/2006/main"/>
                 </wp:cNvGraphicFramePr>
@@ -669,7 +668,25 @@
                                 <w:sz w:val="18"/>
                                 <w:szCs w:val="18"/>
                               </w:rPr>
-                              <w:t>hash: +++hash+++</w:t>
+                              <w:t>Hash: +++hash</w:t>
+                            </w:r>
+                            <w:r>
+                              <w:rPr>
+                                <w:rFonts w:ascii="Courier New" w:hAnsi="Courier New" w:cs="Courier New"/>
+                                <w:color w:val="595959" w:themeColor="text1" w:themeTint="A6"/>
+                                <w:sz w:val="18"/>
+                                <w:szCs w:val="18"/>
+                              </w:rPr>
+                              <w:t>_verificacion</w:t>
+                            </w:r>
+                            <w:r>
+                              <w:rPr>
+                                <w:rFonts w:ascii="Courier New" w:hAnsi="Courier New" w:cs="Courier New"/>
+                                <w:color w:val="595959" w:themeColor="text1" w:themeTint="A6"/>
+                                <w:sz w:val="18"/>
+                                <w:szCs w:val="18"/>
+                              </w:rPr>
+                              <w:t>+++</w:t>
                             </w:r>
                           </w:p>
                         </w:txbxContent>
@@ -680,18 +697,18 @@
                     </wps:wsp>
                   </a:graphicData>
                 </a:graphic>
-                <wp14:sizeRelH relativeFrom="margin">
+                <wp14:sizeRelH relativeFrom="page">
                   <wp14:pctWidth>0</wp14:pctWidth>
                 </wp14:sizeRelH>
-                <wp14:sizeRelV relativeFrom="margin">
-                  <wp14:pctHeight>20000</wp14:pctHeight>
+                <wp14:sizeRelV relativeFrom="page">
+                  <wp14:pctHeight>0</wp14:pctHeight>
                 </wp14:sizeRelV>
               </wp:anchor>
             </w:drawing>
           </mc:Choice>
           <mc:Fallback>
             <w:pict>
-              <v:shape w14:anchorId="279BB56B" id="Cuadro de texto 2" o:spid="_x0000_s1027" type="#_x0000_t202" style="position:absolute;left:0;text-align:left;margin-left:220.7pt;margin-top:328.7pt;width:227.75pt;height:110.6pt;z-index:251663360;visibility:visible;mso-wrap-style:square;mso-width-percent:0;mso-height-percent:200;mso-wrap-distance-left:9pt;mso-wrap-distance-top:3.6pt;mso-wrap-distance-right:9pt;mso-wrap-distance-bottom:3.6pt;mso-position-horizontal:absolute;mso-position-horizontal-relative:text;mso-position-vertical:absolute;mso-position-vertical-relative:text;mso-width-percent:0;mso-height-percent:200;mso-width-relative:margin;mso-height-relative:margin;v-text-anchor:top" o:gfxdata="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" filled="f" stroked="f">
+              <v:shape w14:anchorId="1DC6D429" id="Cuadro de texto 14" o:spid="_x0000_s1027" type="#_x0000_t202" style="position:absolute;left:0;text-align:left;margin-left:219.95pt;margin-top:261pt;width:227.75pt;height:110.6pt;z-index:-251639808;visibility:visible;mso-wrap-style:square;mso-width-percent:0;mso-height-percent:0;mso-wrap-distance-left:9pt;mso-wrap-distance-top:0;mso-wrap-distance-right:9pt;mso-wrap-distance-bottom:0;mso-position-horizontal:absolute;mso-position-horizontal-relative:margin;mso-position-vertical:absolute;mso-position-vertical-relative:text;mso-width-percent:0;mso-height-percent:0;mso-width-relative:page;mso-height-relative:page;v-text-anchor:top" o:gfxdata="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" filled="f" stroked="f">
                 <v:textbox style="mso-fit-shape-to-text:t">
                   <w:txbxContent>
                     <w:p>
@@ -711,11 +728,30 @@
                           <w:sz w:val="18"/>
                           <w:szCs w:val="18"/>
                         </w:rPr>
-                        <w:t>hash: +++hash+++</w:t>
+                        <w:t>Hash: +++hash</w:t>
+                      </w:r>
+                      <w:r>
+                        <w:rPr>
+                          <w:rFonts w:ascii="Courier New" w:hAnsi="Courier New" w:cs="Courier New"/>
+                          <w:color w:val="595959" w:themeColor="text1" w:themeTint="A6"/>
+                          <w:sz w:val="18"/>
+                          <w:szCs w:val="18"/>
+                        </w:rPr>
+                        <w:t>_verificacion</w:t>
+                      </w:r>
+                      <w:r>
+                        <w:rPr>
+                          <w:rFonts w:ascii="Courier New" w:hAnsi="Courier New" w:cs="Courier New"/>
+                          <w:color w:val="595959" w:themeColor="text1" w:themeTint="A6"/>
+                          <w:sz w:val="18"/>
+                          <w:szCs w:val="18"/>
+                        </w:rPr>
+                        <w:t>+++</w:t>
                       </w:r>
                     </w:p>
                   </w:txbxContent>
                 </v:textbox>
+                <w10:wrap anchorx="margin"/>
               </v:shape>
             </w:pict>
           </mc:Fallback>
@@ -733,7 +769,7 @@
         <mc:AlternateContent>
           <mc:Choice Requires="wps">
             <w:drawing>
-              <wp:anchor distT="45720" distB="45720" distL="114300" distR="114300" simplePos="0" relativeHeight="251660288" behindDoc="0" locked="1" layoutInCell="1" allowOverlap="1" wp14:anchorId="2ED3699C" wp14:editId="648DA42A">
+              <wp:anchor distT="45720" distB="45720" distL="114300" distR="114300" simplePos="0" relativeHeight="251660288" behindDoc="0" locked="1" layoutInCell="1" allowOverlap="1" wp14:anchorId="2ED3699C" wp14:editId="1903769B">
                 <wp:simplePos x="0" y="0"/>
                 <wp:positionH relativeFrom="margin">
                   <wp:posOffset>4405630</wp:posOffset>
@@ -774,31 +810,7 @@
                         <w:txbxContent>
                           <w:p>
                             <w:r>
-                              <w:t xml:space="preserve">+++IMAGE </w:t>
-                            </w:r>
-                            <w:proofErr w:type="spellStart"/>
-                            <w:r>
-                              <w:t>qr</w:t>
-                            </w:r>
-                            <w:proofErr w:type="spellEnd"/>
-                            <w:r>
-                              <w:t>(</w:t>
-                            </w:r>
-                            <w:proofErr w:type="spellStart"/>
-                            <w:r>
-                              <w:t>short_</w:t>
-                            </w:r>
-                            <w:proofErr w:type="gramStart"/>
-                            <w:r>
-                              <w:t>url</w:t>
-                            </w:r>
-                            <w:proofErr w:type="spellEnd"/>
-                            <w:r>
-                              <w:t>)+</w:t>
-                            </w:r>
-                            <w:proofErr w:type="gramEnd"/>
-                            <w:r>
-                              <w:t>++</w:t>
+                              <w:t>+++IMAGE qr(short_url)+++</w:t>
                             </w:r>
                           </w:p>
                         </w:txbxContent>
@@ -820,36 +832,12 @@
           </mc:Choice>
           <mc:Fallback>
             <w:pict>
-              <v:shape w14:anchorId="2ED3699C" id="_x0000_s1028" type="#_x0000_t202" style="position:absolute;left:0;text-align:left;margin-left:346.9pt;margin-top:554.8pt;width:103.2pt;height:94.7pt;z-index:251660288;visibility:visible;mso-wrap-style:square;mso-width-percent:0;mso-height-percent:0;mso-wrap-distance-left:9pt;mso-wrap-distance-top:3.6pt;mso-wrap-distance-right:9pt;mso-wrap-distance-bottom:3.6pt;mso-position-horizontal:absolute;mso-position-horizontal-relative:margin;mso-position-vertical:absolute;mso-position-vertical-relative:page;mso-width-percent:0;mso-height-percent:0;mso-width-relative:margin;mso-height-relative:margin;v-text-anchor:top" o:gfxdata="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" filled="f" stroked="f">
+              <v:shape w14:anchorId="2ED3699C" id="Cuadro de texto 2" o:spid="_x0000_s1028" type="#_x0000_t202" style="position:absolute;left:0;text-align:left;margin-left:346.9pt;margin-top:554.8pt;width:103.2pt;height:94.7pt;z-index:251660288;visibility:visible;mso-wrap-style:square;mso-width-percent:0;mso-height-percent:0;mso-wrap-distance-left:9pt;mso-wrap-distance-top:3.6pt;mso-wrap-distance-right:9pt;mso-wrap-distance-bottom:3.6pt;mso-position-horizontal:absolute;mso-position-horizontal-relative:margin;mso-position-vertical:absolute;mso-position-vertical-relative:page;mso-width-percent:0;mso-height-percent:0;mso-width-relative:margin;mso-height-relative:margin;v-text-anchor:top" o:gfxdata="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" filled="f" stroked="f">
                 <v:textbox>
                   <w:txbxContent>
                     <w:p>
                       <w:r>
-                        <w:t xml:space="preserve">+++IMAGE </w:t>
-                      </w:r>
-                      <w:proofErr w:type="spellStart"/>
-                      <w:r>
-                        <w:t>qr</w:t>
-                      </w:r>
-                      <w:proofErr w:type="spellEnd"/>
-                      <w:r>
-                        <w:t>(</w:t>
-                      </w:r>
-                      <w:proofErr w:type="spellStart"/>
-                      <w:r>
-                        <w:t>short_</w:t>
-                      </w:r>
-                      <w:proofErr w:type="gramStart"/>
-                      <w:r>
-                        <w:t>url</w:t>
-                      </w:r>
-                      <w:proofErr w:type="spellEnd"/>
-                      <w:r>
-                        <w:t>)+</w:t>
-                      </w:r>
-                      <w:proofErr w:type="gramEnd"/>
-                      <w:r>
-                        <w:t>++</w:t>
+                        <w:t>+++IMAGE qr(short_url)+++</w:t>
                       </w:r>
                     </w:p>
                   </w:txbxContent>

</xml_diff>